<commit_message>
Finishing CRM MCKUADRAT: UI, Auto-fill AO, WA Document PIC, & Deduplication
</commit_message>
<xml_diff>
--- a/public/surat/INVOICE_template.docx
+++ b/public/surat/INVOICE_template.docx
@@ -6,7 +6,7 @@
       <w:pPr>
         <w:pStyle w:val="Header"/>
         <w:rPr>
-          <w:rFonts w:ascii="Arial" w:hAnsi="Arial" w:cs="Arial"/>
+          <w:rFonts w:asciiTheme="minorHAnsi" w:hAnsiTheme="minorHAnsi" w:cstheme="minorHAnsi"/>
           <w:b/>
           <w:sz w:val="60"/>
           <w:szCs w:val="60"/>
@@ -18,7 +18,7 @@
       <w:pPr>
         <w:pStyle w:val="Header"/>
         <w:rPr>
-          <w:rFonts w:ascii="Arial" w:hAnsi="Arial" w:cs="Arial"/>
+          <w:rFonts w:asciiTheme="minorHAnsi" w:hAnsiTheme="minorHAnsi" w:cstheme="minorHAnsi"/>
           <w:b/>
           <w:sz w:val="60"/>
           <w:szCs w:val="60"/>
@@ -27,7 +27,7 @@
       </w:pPr>
       <w:r>
         <w:rPr>
-          <w:rFonts w:ascii="Arial" w:hAnsi="Arial" w:cs="Arial"/>
+          <w:rFonts w:asciiTheme="minorHAnsi" w:hAnsiTheme="minorHAnsi" w:cstheme="minorHAnsi"/>
           <w:b/>
           <w:sz w:val="60"/>
           <w:szCs w:val="60"/>
@@ -37,7 +37,7 @@
       </w:r>
       <w:r>
         <w:rPr>
-          <w:rFonts w:ascii="Arial" w:hAnsi="Arial" w:cs="Arial"/>
+          <w:rFonts w:asciiTheme="minorHAnsi" w:hAnsiTheme="minorHAnsi" w:cstheme="minorHAnsi"/>
           <w:b/>
           <w:sz w:val="60"/>
           <w:szCs w:val="60"/>
@@ -50,14 +50,14 @@
       <w:pPr>
         <w:spacing w:after="0" w:line="360" w:lineRule="auto"/>
         <w:rPr>
-          <w:rFonts w:ascii="Arial" w:hAnsi="Arial" w:cs="Arial"/>
-          <w:sz w:val="24"/>
-          <w:szCs w:val="24"/>
-        </w:rPr>
-      </w:pPr>
-      <w:r>
-        <w:rPr>
-          <w:rFonts w:ascii="Arial" w:hAnsi="Arial" w:cs="Arial"/>
+          <w:rFonts w:cstheme="minorHAnsi"/>
+          <w:sz w:val="24"/>
+          <w:szCs w:val="24"/>
+        </w:rPr>
+      </w:pPr>
+      <w:r>
+        <w:rPr>
+          <w:rFonts w:cstheme="minorHAnsi"/>
           <w:sz w:val="24"/>
           <w:szCs w:val="24"/>
           <w:lang w:val="sv-SE"/>
@@ -66,113 +66,34 @@
       </w:r>
       <w:r>
         <w:rPr>
-          <w:rFonts w:ascii="Arial" w:hAnsi="Arial" w:cs="Arial"/>
+          <w:rFonts w:cstheme="minorHAnsi"/>
           <w:sz w:val="24"/>
           <w:szCs w:val="24"/>
           <w:lang w:val="sv-SE"/>
         </w:rPr>
-        <w:t>0</w:t>
-      </w:r>
-      <w:r>
-        <w:rPr>
-          <w:rFonts w:ascii="Arial" w:hAnsi="Arial" w:cs="Arial"/>
+        <w:t>{</w:t>
+      </w:r>
+      <w:r>
+        <w:rPr>
+          <w:rFonts w:cstheme="minorHAnsi"/>
           <w:sz w:val="24"/>
           <w:szCs w:val="24"/>
           <w:lang w:val="sv-SE"/>
         </w:rPr>
-        <w:t>0</w:t>
-      </w:r>
-      <w:r>
-        <w:rPr>
-          <w:rFonts w:ascii="Arial" w:hAnsi="Arial" w:cs="Arial"/>
+        <w:t>nomor</w:t>
+      </w:r>
+      <w:r>
+        <w:rPr>
+          <w:rFonts w:cstheme="minorHAnsi"/>
           <w:sz w:val="24"/>
           <w:szCs w:val="24"/>
           <w:lang w:val="sv-SE"/>
         </w:rPr>
-        <w:t>5</w:t>
-      </w:r>
-      <w:r>
-        <w:rPr>
-          <w:rFonts w:ascii="Arial" w:hAnsi="Arial" w:cs="Arial"/>
-          <w:sz w:val="24"/>
-          <w:szCs w:val="24"/>
-        </w:rPr>
-        <w:t>/</w:t>
-      </w:r>
-      <w:r>
-        <w:rPr>
-          <w:rFonts w:ascii="Arial" w:hAnsi="Arial" w:cs="Arial"/>
-          <w:sz w:val="24"/>
-          <w:szCs w:val="24"/>
-        </w:rPr>
-        <w:t xml:space="preserve"> </w:t>
-      </w:r>
-      <w:r>
-        <w:rPr>
-          <w:rFonts w:ascii="Arial" w:hAnsi="Arial" w:cs="Arial"/>
-          <w:sz w:val="24"/>
-          <w:szCs w:val="24"/>
-          <w:lang w:val="sv-SE"/>
-        </w:rPr>
-        <w:t>MCC</w:t>
-      </w:r>
-      <w:r>
-        <w:rPr>
-          <w:rFonts w:ascii="Arial" w:hAnsi="Arial" w:cs="Arial"/>
-          <w:sz w:val="24"/>
-          <w:szCs w:val="24"/>
-          <w:lang w:val="sv-SE"/>
-        </w:rPr>
-        <w:t xml:space="preserve">/ </w:t>
-      </w:r>
-      <w:r>
-        <w:rPr>
-          <w:rFonts w:ascii="Arial" w:hAnsi="Arial" w:cs="Arial"/>
-          <w:sz w:val="24"/>
-          <w:szCs w:val="24"/>
-          <w:lang w:val="sv-SE"/>
-        </w:rPr>
-        <w:t>IV</w:t>
-      </w:r>
-      <w:r>
-        <w:rPr>
-          <w:rFonts w:ascii="Arial" w:hAnsi="Arial" w:cs="Arial"/>
-          <w:sz w:val="24"/>
-          <w:szCs w:val="24"/>
-          <w:lang w:val="sv-SE"/>
-        </w:rPr>
-        <w:t>/</w:t>
-      </w:r>
-      <w:r>
-        <w:rPr>
-          <w:rFonts w:ascii="Arial" w:hAnsi="Arial" w:cs="Arial"/>
-          <w:sz w:val="24"/>
-          <w:szCs w:val="24"/>
-          <w:lang w:val="sv-SE"/>
-        </w:rPr>
-        <w:t xml:space="preserve"> </w:t>
-      </w:r>
-      <w:r>
-        <w:rPr>
-          <w:rFonts w:ascii="Arial" w:hAnsi="Arial" w:cs="Arial"/>
-          <w:sz w:val="24"/>
-          <w:szCs w:val="24"/>
-          <w:lang w:val="sv-SE"/>
-        </w:rPr>
-        <w:t>202</w:t>
-      </w:r>
-      <w:r>
-        <w:rPr>
-          <w:rFonts w:ascii="Arial" w:hAnsi="Arial" w:cs="Arial"/>
-          <w:sz w:val="24"/>
-          <w:szCs w:val="24"/>
-          <w:lang w:val="sv-SE"/>
-        </w:rPr>
-        <w:t>6</w:t>
-      </w:r>
-      <w:r>
-        <w:rPr>
-          <w:rFonts w:ascii="Arial" w:hAnsi="Arial" w:cs="Arial"/>
+        <w:t>}</w:t>
+      </w:r>
+      <w:r>
+        <w:rPr>
+          <w:rFonts w:cstheme="minorHAnsi"/>
           <w:sz w:val="24"/>
           <w:szCs w:val="24"/>
         </w:rPr>
@@ -180,7 +101,7 @@
       </w:r>
       <w:r>
         <w:rPr>
-          <w:rFonts w:ascii="Arial" w:hAnsi="Arial" w:cs="Arial"/>
+          <w:rFonts w:cstheme="minorHAnsi"/>
           <w:sz w:val="24"/>
           <w:szCs w:val="24"/>
         </w:rPr>
@@ -188,7 +109,7 @@
       </w:r>
       <w:r>
         <w:rPr>
-          <w:rFonts w:ascii="Arial" w:hAnsi="Arial" w:cs="Arial"/>
+          <w:rFonts w:cstheme="minorHAnsi"/>
           <w:sz w:val="24"/>
           <w:szCs w:val="24"/>
         </w:rPr>
@@ -196,7 +117,7 @@
       </w:r>
       <w:r>
         <w:rPr>
-          <w:rFonts w:ascii="Arial" w:hAnsi="Arial" w:cs="Arial"/>
+          <w:rFonts w:cstheme="minorHAnsi"/>
           <w:sz w:val="24"/>
           <w:szCs w:val="24"/>
         </w:rPr>
@@ -207,7 +128,7 @@
       <w:pPr>
         <w:spacing w:after="0" w:line="360" w:lineRule="auto"/>
         <w:rPr>
-          <w:rFonts w:ascii="Arial" w:hAnsi="Arial" w:cs="Arial"/>
+          <w:rFonts w:cstheme="minorHAnsi"/>
           <w:sz w:val="24"/>
           <w:szCs w:val="24"/>
           <w:lang w:val="sv-SE"/>
@@ -219,7 +140,7 @@
         <w:spacing w:after="0" w:line="360" w:lineRule="auto"/>
         <w:jc w:val="both"/>
         <w:rPr>
-          <w:rFonts w:ascii="Arial" w:hAnsi="Arial" w:cs="Arial"/>
+          <w:rFonts w:cstheme="minorHAnsi"/>
           <w:b/>
           <w:bCs/>
           <w:sz w:val="24"/>
@@ -229,7 +150,7 @@
       </w:pPr>
       <w:r>
         <w:rPr>
-          <w:rFonts w:ascii="Arial" w:hAnsi="Arial" w:cs="Arial"/>
+          <w:rFonts w:cstheme="minorHAnsi"/>
           <w:sz w:val="24"/>
           <w:szCs w:val="24"/>
           <w:lang w:val="sv-SE"/>
@@ -243,14 +164,14 @@
         <w:spacing w:line="276" w:lineRule="auto"/>
         <w:jc w:val="both"/>
         <w:rPr>
-          <w:rFonts w:ascii="Arial" w:eastAsiaTheme="minorEastAsia" w:hAnsi="Arial" w:cs="Arial"/>
+          <w:rFonts w:asciiTheme="minorHAnsi" w:eastAsiaTheme="minorEastAsia" w:hAnsiTheme="minorHAnsi" w:cstheme="minorHAnsi"/>
           <w:b/>
           <w:lang w:val="id-ID"/>
         </w:rPr>
       </w:pPr>
       <w:r>
         <w:rPr>
-          <w:rFonts w:ascii="Arial" w:eastAsiaTheme="minorEastAsia" w:hAnsi="Arial" w:cs="Arial"/>
+          <w:rFonts w:asciiTheme="minorHAnsi" w:eastAsiaTheme="minorEastAsia" w:hAnsiTheme="minorHAnsi" w:cstheme="minorHAnsi"/>
           <w:b/>
           <w:lang w:val="id-ID"/>
         </w:rPr>
@@ -258,7 +179,7 @@
       </w:r>
       <w:r>
         <w:rPr>
-          <w:rFonts w:ascii="Arial" w:eastAsiaTheme="minorEastAsia" w:hAnsi="Arial" w:cs="Arial"/>
+          <w:rFonts w:asciiTheme="minorHAnsi" w:eastAsiaTheme="minorEastAsia" w:hAnsiTheme="minorHAnsi" w:cstheme="minorHAnsi"/>
           <w:b/>
           <w:lang w:val="id-ID"/>
         </w:rPr>
@@ -266,11 +187,27 @@
       </w:r>
       <w:r>
         <w:rPr>
-          <w:rFonts w:ascii="Arial" w:eastAsiaTheme="minorEastAsia" w:hAnsi="Arial" w:cs="Arial"/>
+          <w:rFonts w:asciiTheme="minorHAnsi" w:eastAsiaTheme="minorEastAsia" w:hAnsiTheme="minorHAnsi" w:cstheme="minorHAnsi"/>
           <w:b/>
           <w:lang w:val="id-ID"/>
         </w:rPr>
-        <w:t>SD Kesatuan Bogor</w:t>
+        <w:t>{</w:t>
+      </w:r>
+      <w:r>
+        <w:rPr>
+          <w:rFonts w:asciiTheme="minorHAnsi" w:eastAsiaTheme="minorEastAsia" w:hAnsiTheme="minorHAnsi" w:cstheme="minorHAnsi"/>
+          <w:b/>
+          <w:lang w:val="id-ID"/>
+        </w:rPr>
+        <w:t>sekolah</w:t>
+      </w:r>
+      <w:r>
+        <w:rPr>
+          <w:rFonts w:asciiTheme="minorHAnsi" w:eastAsiaTheme="minorEastAsia" w:hAnsiTheme="minorHAnsi" w:cstheme="minorHAnsi"/>
+          <w:b/>
+          <w:lang w:val="id-ID"/>
+        </w:rPr>
+        <w:t>}</w:t>
       </w:r>
     </w:p>
     <w:p>
@@ -278,7 +215,7 @@
         <w:pStyle w:val="BodyText"/>
         <w:spacing w:after="0" w:line="360" w:lineRule="auto"/>
         <w:rPr>
-          <w:rFonts w:ascii="Arial" w:hAnsi="Arial" w:cs="Arial"/>
+          <w:rFonts w:asciiTheme="minorHAnsi" w:hAnsiTheme="minorHAnsi" w:cstheme="minorHAnsi"/>
           <w:bCs/>
           <w:sz w:val="24"/>
           <w:szCs w:val="24"/>
@@ -287,7 +224,7 @@
       </w:pPr>
       <w:r>
         <w:rPr>
-          <w:rFonts w:ascii="Arial" w:hAnsi="Arial" w:cs="Arial"/>
+          <w:rFonts w:asciiTheme="minorHAnsi" w:hAnsiTheme="minorHAnsi" w:cstheme="minorHAnsi"/>
           <w:bCs/>
           <w:sz w:val="24"/>
           <w:szCs w:val="24"/>
@@ -300,7 +237,7 @@
       <w:pPr>
         <w:spacing w:after="0" w:line="360" w:lineRule="auto"/>
         <w:rPr>
-          <w:rFonts w:ascii="Arial" w:hAnsi="Arial" w:cs="Arial"/>
+          <w:rFonts w:cstheme="minorHAnsi"/>
           <w:sz w:val="24"/>
           <w:szCs w:val="24"/>
         </w:rPr>
@@ -309,15 +246,14 @@
     <w:tbl>
       <w:tblPr>
         <w:tblStyle w:val="PlainTable5"/>
-        <w:tblW w:w="10287" w:type="dxa"/>
-        <w:tblInd w:w="-567" w:type="dxa"/>
+        <w:tblW w:w="9164" w:type="dxa"/>
         <w:tblLayout w:type="fixed"/>
         <w:tblLook w:val="04A0" w:firstRow="1" w:lastRow="0" w:firstColumn="1" w:lastColumn="0" w:noHBand="0" w:noVBand="1"/>
       </w:tblPr>
       <w:tblGrid>
         <w:gridCol w:w="709"/>
-        <w:gridCol w:w="5103"/>
-        <w:gridCol w:w="1701"/>
+        <w:gridCol w:w="5411"/>
+        <w:gridCol w:w="270"/>
         <w:gridCol w:w="2774"/>
       </w:tblGrid>
       <w:tr>
@@ -336,7 +272,7 @@
               <w:spacing w:line="360" w:lineRule="auto"/>
               <w:jc w:val="center"/>
               <w:rPr>
-                <w:rFonts w:ascii="Arial" w:hAnsi="Arial" w:cs="Arial"/>
+                <w:rFonts w:asciiTheme="minorHAnsi" w:hAnsiTheme="minorHAnsi" w:cstheme="minorHAnsi"/>
                 <w:b/>
                 <w:bCs/>
                 <w:sz w:val="24"/>
@@ -345,7 +281,7 @@
             </w:pPr>
             <w:r>
               <w:rPr>
-                <w:rFonts w:ascii="Arial" w:hAnsi="Arial" w:cs="Arial"/>
+                <w:rFonts w:asciiTheme="minorHAnsi" w:hAnsiTheme="minorHAnsi" w:cstheme="minorHAnsi"/>
                 <w:b/>
                 <w:bCs/>
                 <w:sz w:val="24"/>
@@ -357,7 +293,7 @@
         </w:tc>
         <w:tc>
           <w:tcPr>
-            <w:tcW w:w="5103" w:type="dxa"/>
+            <w:tcW w:w="5411" w:type="dxa"/>
             <w:vAlign w:val="center"/>
           </w:tcPr>
           <w:p>
@@ -366,7 +302,7 @@
               <w:jc w:val="center"/>
               <w:cnfStyle w:val="100000000000" w:firstRow="1" w:lastRow="0" w:firstColumn="0" w:lastColumn="0" w:oddVBand="0" w:evenVBand="0" w:oddHBand="0" w:evenHBand="0" w:firstRowFirstColumn="0" w:firstRowLastColumn="0" w:lastRowFirstColumn="0" w:lastRowLastColumn="0"/>
               <w:rPr>
-                <w:rFonts w:ascii="Arial" w:hAnsi="Arial" w:cs="Arial"/>
+                <w:rFonts w:asciiTheme="minorHAnsi" w:hAnsiTheme="minorHAnsi" w:cstheme="minorHAnsi"/>
                 <w:b/>
                 <w:bCs/>
                 <w:sz w:val="24"/>
@@ -375,7 +311,7 @@
             </w:pPr>
             <w:r>
               <w:rPr>
-                <w:rFonts w:ascii="Arial" w:hAnsi="Arial" w:cs="Arial"/>
+                <w:rFonts w:asciiTheme="minorHAnsi" w:hAnsiTheme="minorHAnsi" w:cstheme="minorHAnsi"/>
                 <w:b/>
                 <w:bCs/>
                 <w:sz w:val="24"/>
@@ -387,7 +323,7 @@
         </w:tc>
         <w:tc>
           <w:tcPr>
-            <w:tcW w:w="1701" w:type="dxa"/>
+            <w:tcW w:w="270" w:type="dxa"/>
             <w:vAlign w:val="center"/>
           </w:tcPr>
           <w:p>
@@ -396,7 +332,7 @@
               <w:jc w:val="center"/>
               <w:cnfStyle w:val="100000000000" w:firstRow="1" w:lastRow="0" w:firstColumn="0" w:lastColumn="0" w:oddVBand="0" w:evenVBand="0" w:oddHBand="0" w:evenHBand="0" w:firstRowFirstColumn="0" w:firstRowLastColumn="0" w:lastRowFirstColumn="0" w:lastRowLastColumn="0"/>
               <w:rPr>
-                <w:rFonts w:ascii="Arial" w:hAnsi="Arial" w:cs="Arial"/>
+                <w:rFonts w:asciiTheme="minorHAnsi" w:hAnsiTheme="minorHAnsi" w:cstheme="minorHAnsi"/>
                 <w:b/>
                 <w:bCs/>
                 <w:sz w:val="24"/>
@@ -417,7 +353,7 @@
               <w:jc w:val="center"/>
               <w:cnfStyle w:val="100000000000" w:firstRow="1" w:lastRow="0" w:firstColumn="0" w:lastColumn="0" w:oddVBand="0" w:evenVBand="0" w:oddHBand="0" w:evenHBand="0" w:firstRowFirstColumn="0" w:firstRowLastColumn="0" w:lastRowFirstColumn="0" w:lastRowLastColumn="0"/>
               <w:rPr>
-                <w:rFonts w:ascii="Arial" w:hAnsi="Arial" w:cs="Arial"/>
+                <w:rFonts w:asciiTheme="minorHAnsi" w:hAnsiTheme="minorHAnsi" w:cstheme="minorHAnsi"/>
                 <w:b/>
                 <w:bCs/>
                 <w:sz w:val="24"/>
@@ -427,7 +363,7 @@
             </w:pPr>
             <w:r>
               <w:rPr>
-                <w:rFonts w:ascii="Arial" w:hAnsi="Arial" w:cs="Arial"/>
+                <w:rFonts w:asciiTheme="minorHAnsi" w:hAnsiTheme="minorHAnsi" w:cstheme="minorHAnsi"/>
                 <w:b/>
                 <w:bCs/>
                 <w:sz w:val="24"/>
@@ -453,60 +389,27 @@
           <w:p>
             <w:pPr>
               <w:spacing w:line="360" w:lineRule="auto"/>
-              <w:jc w:val="center"/>
-              <w:rPr>
-                <w:rFonts w:ascii="Arial" w:hAnsi="Arial" w:cs="Arial"/>
-                <w:sz w:val="24"/>
-                <w:szCs w:val="24"/>
-              </w:rPr>
-            </w:pPr>
-          </w:p>
-          <w:p>
-            <w:pPr>
-              <w:spacing w:line="360" w:lineRule="auto"/>
               <w:ind w:left="142"/>
               <w:jc w:val="center"/>
               <w:rPr>
-                <w:rFonts w:ascii="Arial" w:hAnsi="Arial" w:cs="Arial"/>
+                <w:rFonts w:asciiTheme="minorHAnsi" w:hAnsiTheme="minorHAnsi" w:cstheme="minorHAnsi"/>
                 <w:sz w:val="24"/>
                 <w:szCs w:val="24"/>
               </w:rPr>
             </w:pPr>
             <w:r>
               <w:rPr>
-                <w:rFonts w:ascii="Arial" w:hAnsi="Arial" w:cs="Arial"/>
+                <w:rFonts w:asciiTheme="minorHAnsi" w:hAnsiTheme="minorHAnsi" w:cstheme="minorHAnsi"/>
                 <w:sz w:val="24"/>
                 <w:szCs w:val="24"/>
               </w:rPr>
               <w:t>1.</w:t>
             </w:r>
           </w:p>
-          <w:p>
-            <w:pPr>
-              <w:spacing w:line="360" w:lineRule="auto"/>
-              <w:jc w:val="center"/>
-              <w:rPr>
-                <w:rFonts w:ascii="Arial" w:hAnsi="Arial" w:cs="Arial"/>
-                <w:sz w:val="24"/>
-                <w:szCs w:val="24"/>
-              </w:rPr>
-            </w:pPr>
-          </w:p>
-          <w:p>
-            <w:pPr>
-              <w:spacing w:line="360" w:lineRule="auto"/>
-              <w:jc w:val="center"/>
-              <w:rPr>
-                <w:rFonts w:ascii="Arial" w:hAnsi="Arial" w:cs="Arial"/>
-                <w:sz w:val="24"/>
-                <w:szCs w:val="24"/>
-              </w:rPr>
-            </w:pPr>
-          </w:p>
         </w:tc>
         <w:tc>
           <w:tcPr>
-            <w:tcW w:w="5103" w:type="dxa"/>
+            <w:tcW w:w="5411" w:type="dxa"/>
             <w:vAlign w:val="center"/>
           </w:tcPr>
           <w:p>
@@ -515,7 +418,7 @@
               <w:ind w:right="473"/>
               <w:cnfStyle w:val="000000100000" w:firstRow="0" w:lastRow="0" w:firstColumn="0" w:lastColumn="0" w:oddVBand="0" w:evenVBand="0" w:oddHBand="1" w:evenHBand="0" w:firstRowFirstColumn="0" w:firstRowLastColumn="0" w:lastRowFirstColumn="0" w:lastRowLastColumn="0"/>
               <w:rPr>
-                <w:rFonts w:ascii="Arial" w:hAnsi="Arial" w:cs="Arial"/>
+                <w:rFonts w:asciiTheme="minorHAnsi" w:hAnsiTheme="minorHAnsi" w:cstheme="minorHAnsi"/>
                 <w:b/>
                 <w:bCs/>
                 <w:sz w:val="24"/>
@@ -525,55 +428,40 @@
             </w:pPr>
             <w:r>
               <w:rPr>
-                <w:rFonts w:ascii="Arial" w:hAnsi="Arial" w:cs="Arial"/>
+                <w:rFonts w:asciiTheme="minorHAnsi" w:hAnsiTheme="minorHAnsi" w:cstheme="minorHAnsi"/>
                 <w:b/>
                 <w:bCs/>
                 <w:sz w:val="24"/>
                 <w:szCs w:val="24"/>
                 <w:lang w:val="sv-SE"/>
               </w:rPr>
-              <w:t xml:space="preserve">Program </w:t>
+              <w:t>{program</w:t>
             </w:r>
             <w:r>
               <w:rPr>
-                <w:rFonts w:ascii="Arial" w:hAnsi="Arial" w:cs="Arial"/>
+                <w:rFonts w:asciiTheme="minorHAnsi" w:hAnsiTheme="minorHAnsi" w:cstheme="minorHAnsi"/>
                 <w:b/>
                 <w:bCs/>
                 <w:sz w:val="24"/>
                 <w:szCs w:val="24"/>
                 <w:lang w:val="sv-SE"/>
               </w:rPr>
-              <w:t>Inhouse Motivation Training</w:t>
+              <w:t>}</w:t>
             </w:r>
-          </w:p>
-          <w:p>
-            <w:pPr>
-              <w:spacing w:line="360" w:lineRule="auto"/>
-              <w:ind w:right="473"/>
-              <w:cnfStyle w:val="000000100000" w:firstRow="0" w:lastRow="0" w:firstColumn="0" w:lastColumn="0" w:oddVBand="0" w:evenVBand="0" w:oddHBand="1" w:evenHBand="0" w:firstRowFirstColumn="0" w:firstRowLastColumn="0" w:lastRowFirstColumn="0" w:lastRowLastColumn="0"/>
+            <w:r>
               <w:rPr>
-                <w:rFonts w:ascii="Arial" w:hAnsi="Arial" w:cs="Arial"/>
+                <w:rFonts w:asciiTheme="minorHAnsi" w:hAnsiTheme="minorHAnsi" w:cstheme="minorHAnsi"/>
                 <w:b/>
                 <w:bCs/>
                 <w:sz w:val="24"/>
                 <w:szCs w:val="24"/>
                 <w:lang w:val="sv-SE"/>
               </w:rPr>
-            </w:pPr>
-            <w:r>
-              <w:rPr>
-                <w:rFonts w:ascii="Arial" w:hAnsi="Arial" w:cs="Arial"/>
-                <w:b/>
-                <w:bCs/>
-                <w:sz w:val="24"/>
-                <w:szCs w:val="24"/>
-                <w:lang w:val="sv-SE"/>
-              </w:rPr>
-              <w:t>Kelas 6 SD Kesatuan Bogor</w:t>
+              <w:t>, yang diselenggarakan pada</w:t>
             </w:r>
             <w:r>
               <w:rPr>
-                <w:rFonts w:ascii="Arial" w:hAnsi="Arial" w:cs="Arial"/>
+                <w:rFonts w:asciiTheme="minorHAnsi" w:hAnsiTheme="minorHAnsi" w:cstheme="minorHAnsi"/>
                 <w:b/>
                 <w:bCs/>
                 <w:sz w:val="24"/>
@@ -582,59 +470,33 @@
               </w:rPr>
               <w:t xml:space="preserve"> </w:t>
             </w:r>
-          </w:p>
-          <w:p>
-            <w:pPr>
-              <w:spacing w:line="360" w:lineRule="auto"/>
-              <w:ind w:right="473"/>
-              <w:cnfStyle w:val="000000100000" w:firstRow="0" w:lastRow="0" w:firstColumn="0" w:lastColumn="0" w:oddVBand="0" w:evenVBand="0" w:oddHBand="1" w:evenHBand="0" w:firstRowFirstColumn="0" w:firstRowLastColumn="0" w:lastRowFirstColumn="0" w:lastRowLastColumn="0"/>
+            <w:r>
               <w:rPr>
-                <w:rFonts w:ascii="Arial" w:hAnsi="Arial" w:cs="Arial"/>
+                <w:rFonts w:asciiTheme="minorHAnsi" w:hAnsiTheme="minorHAnsi" w:cstheme="minorHAnsi"/>
                 <w:b/>
                 <w:bCs/>
                 <w:sz w:val="24"/>
                 <w:szCs w:val="24"/>
                 <w:lang w:val="sv-SE"/>
               </w:rPr>
-            </w:pPr>
+              <w:t>{</w:t>
+            </w:r>
             <w:r>
               <w:rPr>
-                <w:rFonts w:ascii="Arial" w:hAnsi="Arial" w:cs="Arial"/>
+                <w:rFonts w:asciiTheme="minorHAnsi" w:hAnsiTheme="minorHAnsi" w:cstheme="minorHAnsi"/>
                 <w:b/>
                 <w:bCs/>
                 <w:sz w:val="24"/>
                 <w:szCs w:val="24"/>
                 <w:lang w:val="sv-SE"/>
               </w:rPr>
-              <w:t xml:space="preserve">Kamis, </w:t>
-            </w:r>
-            <w:r>
-              <w:rPr>
-                <w:rFonts w:ascii="Arial" w:hAnsi="Arial" w:cs="Arial"/>
-                <w:b/>
-                <w:bCs/>
-                <w:sz w:val="24"/>
-                <w:szCs w:val="24"/>
-                <w:lang w:val="sv-SE"/>
-              </w:rPr>
-              <w:t>30 April 2026</w:t>
-            </w:r>
-            <w:r>
-              <w:rPr>
-                <w:rFonts w:ascii="Arial" w:hAnsi="Arial" w:cs="Arial"/>
-                <w:b/>
-                <w:bCs/>
-                <w:sz w:val="24"/>
-                <w:szCs w:val="24"/>
-                <w:lang w:val="sv-SE"/>
-              </w:rPr>
-              <w:t xml:space="preserve"> (Sesi 2)</w:t>
+              <w:t>waktu}</w:t>
             </w:r>
           </w:p>
         </w:tc>
         <w:tc>
           <w:tcPr>
-            <w:tcW w:w="1701" w:type="dxa"/>
+            <w:tcW w:w="270" w:type="dxa"/>
             <w:vAlign w:val="center"/>
           </w:tcPr>
           <w:p>
@@ -643,7 +505,7 @@
               <w:jc w:val="center"/>
               <w:cnfStyle w:val="000000100000" w:firstRow="0" w:lastRow="0" w:firstColumn="0" w:lastColumn="0" w:oddVBand="0" w:evenVBand="0" w:oddHBand="1" w:evenHBand="0" w:firstRowFirstColumn="0" w:firstRowLastColumn="0" w:lastRowFirstColumn="0" w:lastRowLastColumn="0"/>
               <w:rPr>
-                <w:rFonts w:ascii="Arial" w:hAnsi="Arial" w:cs="Arial"/>
+                <w:rFonts w:asciiTheme="minorHAnsi" w:hAnsiTheme="minorHAnsi" w:cstheme="minorHAnsi"/>
                 <w:sz w:val="24"/>
                 <w:szCs w:val="24"/>
                 <w:lang w:val="en-GB"/>
@@ -656,7 +518,7 @@
               <w:jc w:val="center"/>
               <w:cnfStyle w:val="000000100000" w:firstRow="0" w:lastRow="0" w:firstColumn="0" w:lastColumn="0" w:oddVBand="0" w:evenVBand="0" w:oddHBand="1" w:evenHBand="0" w:firstRowFirstColumn="0" w:firstRowLastColumn="0" w:lastRowFirstColumn="0" w:lastRowLastColumn="0"/>
               <w:rPr>
-                <w:rFonts w:ascii="Arial" w:hAnsi="Arial" w:cs="Arial"/>
+                <w:rFonts w:asciiTheme="minorHAnsi" w:hAnsiTheme="minorHAnsi" w:cstheme="minorHAnsi"/>
                 <w:sz w:val="24"/>
                 <w:szCs w:val="24"/>
                 <w:lang w:val="en-GB"/>
@@ -668,7 +530,7 @@
               <w:spacing w:line="360" w:lineRule="auto"/>
               <w:cnfStyle w:val="000000100000" w:firstRow="0" w:lastRow="0" w:firstColumn="0" w:lastColumn="0" w:oddVBand="0" w:evenVBand="0" w:oddHBand="1" w:evenHBand="0" w:firstRowFirstColumn="0" w:firstRowLastColumn="0" w:lastRowFirstColumn="0" w:lastRowLastColumn="0"/>
               <w:rPr>
-                <w:rFonts w:ascii="Arial" w:hAnsi="Arial" w:cs="Arial"/>
+                <w:rFonts w:asciiTheme="minorHAnsi" w:hAnsiTheme="minorHAnsi" w:cstheme="minorHAnsi"/>
                 <w:sz w:val="24"/>
                 <w:szCs w:val="24"/>
                 <w:lang w:val="en-GB"/>
@@ -687,7 +549,7 @@
               <w:jc w:val="center"/>
               <w:cnfStyle w:val="000000100000" w:firstRow="0" w:lastRow="0" w:firstColumn="0" w:lastColumn="0" w:oddVBand="0" w:evenVBand="0" w:oddHBand="1" w:evenHBand="0" w:firstRowFirstColumn="0" w:firstRowLastColumn="0" w:lastRowFirstColumn="0" w:lastRowLastColumn="0"/>
               <w:rPr>
-                <w:rFonts w:ascii="Arial" w:hAnsi="Arial" w:cs="Arial"/>
+                <w:rFonts w:asciiTheme="minorHAnsi" w:hAnsiTheme="minorHAnsi" w:cstheme="minorHAnsi"/>
                 <w:b/>
                 <w:bCs/>
                 <w:sz w:val="24"/>
@@ -696,63 +558,33 @@
             </w:pPr>
             <w:r>
               <w:rPr>
-                <w:rFonts w:ascii="Arial" w:hAnsi="Arial" w:cs="Arial"/>
+                <w:rFonts w:asciiTheme="minorHAnsi" w:hAnsiTheme="minorHAnsi" w:cstheme="minorHAnsi"/>
                 <w:b/>
                 <w:bCs/>
                 <w:sz w:val="24"/>
                 <w:szCs w:val="24"/>
               </w:rPr>
-              <w:t>Rp</w:t>
+              <w:t>{</w:t>
             </w:r>
             <w:r>
               <w:rPr>
-                <w:rFonts w:ascii="Arial" w:hAnsi="Arial" w:cs="Arial"/>
+                <w:rFonts w:asciiTheme="minorHAnsi" w:hAnsiTheme="minorHAnsi" w:cstheme="minorHAnsi"/>
                 <w:b/>
                 <w:bCs/>
                 <w:sz w:val="24"/>
                 <w:szCs w:val="24"/>
               </w:rPr>
-              <w:t xml:space="preserve"> </w:t>
+              <w:t>harga</w:t>
             </w:r>
             <w:r>
               <w:rPr>
-                <w:rFonts w:ascii="Arial" w:hAnsi="Arial" w:cs="Arial"/>
+                <w:rFonts w:asciiTheme="minorHAnsi" w:hAnsiTheme="minorHAnsi" w:cstheme="minorHAnsi"/>
                 <w:b/>
                 <w:bCs/>
                 <w:sz w:val="24"/>
                 <w:szCs w:val="24"/>
               </w:rPr>
-              <w:t>3</w:t>
-            </w:r>
-            <w:r>
-              <w:rPr>
-                <w:rFonts w:ascii="Arial" w:hAnsi="Arial" w:cs="Arial"/>
-                <w:b/>
-                <w:bCs/>
-                <w:sz w:val="24"/>
-                <w:szCs w:val="24"/>
-              </w:rPr>
-              <w:t>.</w:t>
-            </w:r>
-            <w:r>
-              <w:rPr>
-                <w:rFonts w:ascii="Arial" w:hAnsi="Arial" w:cs="Arial"/>
-                <w:b/>
-                <w:bCs/>
-                <w:sz w:val="24"/>
-                <w:szCs w:val="24"/>
-              </w:rPr>
-              <w:t>5</w:t>
-            </w:r>
-            <w:r>
-              <w:rPr>
-                <w:rFonts w:ascii="Arial" w:hAnsi="Arial" w:cs="Arial"/>
-                <w:b/>
-                <w:bCs/>
-                <w:sz w:val="24"/>
-                <w:szCs w:val="24"/>
-              </w:rPr>
-              <w:t>00.000,-</w:t>
+              <w:t>}</w:t>
             </w:r>
           </w:p>
         </w:tc>
@@ -763,17 +595,17 @@
         <w:spacing w:after="0" w:line="360" w:lineRule="auto"/>
         <w:jc w:val="center"/>
         <w:rPr>
-          <w:rFonts w:ascii="Arial" w:hAnsi="Arial" w:cs="Arial"/>
+          <w:rFonts w:cstheme="minorHAnsi"/>
           <w:b/>
           <w:bCs/>
-          <w:sz w:val="32"/>
-          <w:szCs w:val="32"/>
+          <w:sz w:val="24"/>
+          <w:szCs w:val="24"/>
           <w:lang w:val="sv-SE"/>
         </w:rPr>
       </w:pPr>
       <w:r>
         <w:rPr>
-          <w:rFonts w:ascii="Arial" w:hAnsi="Arial" w:cs="Arial"/>
+          <w:rFonts w:cstheme="minorHAnsi"/>
           <w:sz w:val="24"/>
           <w:szCs w:val="24"/>
           <w:lang w:val="sv-SE"/>
@@ -782,7 +614,7 @@
       </w:r>
       <w:r>
         <w:rPr>
-          <w:rFonts w:ascii="Arial" w:hAnsi="Arial" w:cs="Arial"/>
+          <w:rFonts w:cstheme="minorHAnsi"/>
           <w:sz w:val="24"/>
           <w:szCs w:val="24"/>
           <w:lang w:val="sv-SE"/>
@@ -791,7 +623,7 @@
       </w:r>
       <w:r>
         <w:rPr>
-          <w:rFonts w:ascii="Arial" w:hAnsi="Arial" w:cs="Arial"/>
+          <w:rFonts w:cstheme="minorHAnsi"/>
           <w:sz w:val="24"/>
           <w:szCs w:val="24"/>
           <w:lang w:val="sv-SE"/>
@@ -800,7 +632,7 @@
       </w:r>
       <w:r>
         <w:rPr>
-          <w:rFonts w:ascii="Arial" w:hAnsi="Arial" w:cs="Arial"/>
+          <w:rFonts w:cstheme="minorHAnsi"/>
           <w:sz w:val="24"/>
           <w:szCs w:val="24"/>
           <w:lang w:val="sv-SE"/>
@@ -809,7 +641,7 @@
       </w:r>
       <w:r>
         <w:rPr>
-          <w:rFonts w:ascii="Arial" w:hAnsi="Arial" w:cs="Arial"/>
+          <w:rFonts w:cstheme="minorHAnsi"/>
           <w:sz w:val="24"/>
           <w:szCs w:val="24"/>
           <w:lang w:val="sv-SE"/>
@@ -818,7 +650,7 @@
       </w:r>
       <w:r>
         <w:rPr>
-          <w:rFonts w:ascii="Arial" w:hAnsi="Arial" w:cs="Arial"/>
+          <w:rFonts w:cstheme="minorHAnsi"/>
           <w:sz w:val="24"/>
           <w:szCs w:val="24"/>
           <w:lang w:val="sv-SE"/>
@@ -827,7 +659,7 @@
       </w:r>
       <w:r>
         <w:rPr>
-          <w:rFonts w:ascii="Arial" w:hAnsi="Arial" w:cs="Arial"/>
+          <w:rFonts w:cstheme="minorHAnsi"/>
           <w:sz w:val="24"/>
           <w:szCs w:val="24"/>
           <w:lang w:val="sv-SE"/>
@@ -836,136 +668,90 @@
       </w:r>
       <w:r>
         <w:rPr>
-          <w:rFonts w:ascii="Arial" w:hAnsi="Arial" w:cs="Arial"/>
+          <w:rFonts w:cstheme="minorHAnsi"/>
           <w:b/>
           <w:bCs/>
-          <w:sz w:val="32"/>
-          <w:szCs w:val="32"/>
+          <w:sz w:val="24"/>
+          <w:szCs w:val="24"/>
           <w:lang w:val="sv-SE"/>
         </w:rPr>
         <w:t xml:space="preserve">         </w:t>
       </w:r>
       <w:r>
         <w:rPr>
-          <w:rFonts w:ascii="Arial" w:hAnsi="Arial" w:cs="Arial"/>
+          <w:rFonts w:cstheme="minorHAnsi"/>
           <w:b/>
           <w:bCs/>
-          <w:sz w:val="32"/>
-          <w:szCs w:val="32"/>
+          <w:sz w:val="24"/>
+          <w:szCs w:val="24"/>
           <w:lang w:val="sv-SE"/>
         </w:rPr>
         <w:tab/>
       </w:r>
-      <w:r>
-        <w:rPr>
-          <w:rFonts w:ascii="Arial" w:hAnsi="Arial" w:cs="Arial"/>
+    </w:p>
+    <w:p>
+      <w:pPr>
+        <w:spacing w:after="0" w:line="360" w:lineRule="auto"/>
+        <w:rPr>
+          <w:rFonts w:cstheme="minorHAnsi"/>
+          <w:sz w:val="24"/>
+          <w:szCs w:val="24"/>
+          <w:lang w:val="en-GB"/>
+        </w:rPr>
+      </w:pPr>
+      <w:r>
+        <w:rPr>
+          <w:rFonts w:cstheme="minorHAnsi"/>
+          <w:sz w:val="24"/>
+          <w:szCs w:val="24"/>
+          <w:lang w:val="sv-SE"/>
+        </w:rPr>
+        <w:t xml:space="preserve">Terbilang : </w:t>
+      </w:r>
+      <w:r>
+        <w:rPr>
+          <w:rFonts w:cstheme="minorHAnsi"/>
           <w:b/>
           <w:bCs/>
-          <w:sz w:val="32"/>
-          <w:szCs w:val="32"/>
+          <w:sz w:val="24"/>
+          <w:szCs w:val="24"/>
           <w:lang w:val="sv-SE"/>
         </w:rPr>
-        <w:t xml:space="preserve">         </w:t>
-      </w:r>
-      <w:r>
-        <w:rPr>
-          <w:rFonts w:ascii="Arial" w:hAnsi="Arial" w:cs="Arial"/>
+        <w:t>#</w:t>
+      </w:r>
+      <w:r>
+        <w:rPr>
+          <w:rFonts w:cstheme="minorHAnsi"/>
           <w:b/>
-          <w:bCs/>
-          <w:sz w:val="32"/>
-          <w:szCs w:val="32"/>
-          <w:lang w:val="sv-SE"/>
-        </w:rPr>
-        <w:t>Rp</w:t>
-      </w:r>
-      <w:r>
-        <w:rPr>
-          <w:rFonts w:ascii="Arial" w:hAnsi="Arial" w:cs="Arial"/>
+          <w:sz w:val="24"/>
+          <w:szCs w:val="24"/>
+          <w:lang w:val="en-GB"/>
+        </w:rPr>
+        <w:t>{</w:t>
+      </w:r>
+      <w:r>
+        <w:rPr>
+          <w:rFonts w:cstheme="minorHAnsi"/>
           <w:b/>
-          <w:bCs/>
-          <w:sz w:val="32"/>
-          <w:szCs w:val="32"/>
-          <w:lang w:val="sv-SE"/>
-        </w:rPr>
-        <w:t xml:space="preserve"> 3</w:t>
-      </w:r>
-      <w:r>
-        <w:rPr>
-          <w:rFonts w:ascii="Arial" w:hAnsi="Arial" w:cs="Arial"/>
+          <w:sz w:val="24"/>
+          <w:szCs w:val="24"/>
+          <w:lang w:val="en-GB"/>
+        </w:rPr>
+        <w:t>terbilang</w:t>
+      </w:r>
+      <w:r>
+        <w:rPr>
+          <w:rFonts w:cstheme="minorHAnsi"/>
           <w:b/>
-          <w:bCs/>
-          <w:sz w:val="32"/>
-          <w:szCs w:val="32"/>
-          <w:lang w:val="sv-SE"/>
-        </w:rPr>
-        <w:t>.</w:t>
-      </w:r>
-      <w:r>
-        <w:rPr>
-          <w:rFonts w:ascii="Arial" w:hAnsi="Arial" w:cs="Arial"/>
-          <w:b/>
-          <w:bCs/>
-          <w:sz w:val="32"/>
-          <w:szCs w:val="32"/>
-          <w:lang w:val="sv-SE"/>
-        </w:rPr>
-        <w:t>5</w:t>
-      </w:r>
-      <w:r>
-        <w:rPr>
-          <w:rFonts w:ascii="Arial" w:hAnsi="Arial" w:cs="Arial"/>
-          <w:b/>
-          <w:bCs/>
-          <w:sz w:val="32"/>
-          <w:szCs w:val="32"/>
-          <w:lang w:val="sv-SE"/>
-        </w:rPr>
-        <w:t>00.000,-</w:t>
-      </w:r>
-    </w:p>
-    <w:p>
-      <w:pPr>
-        <w:spacing w:after="0" w:line="360" w:lineRule="auto"/>
-        <w:rPr>
-          <w:rFonts w:ascii="Arial" w:hAnsi="Arial" w:cs="Arial"/>
           <w:sz w:val="24"/>
           <w:szCs w:val="24"/>
           <w:lang w:val="en-GB"/>
         </w:rPr>
-      </w:pPr>
-      <w:r>
-        <w:rPr>
-          <w:rFonts w:ascii="Arial" w:hAnsi="Arial" w:cs="Arial"/>
-          <w:sz w:val="24"/>
-          <w:szCs w:val="24"/>
-          <w:lang w:val="sv-SE"/>
-        </w:rPr>
-        <w:t xml:space="preserve">Terbilang : </w:t>
-      </w:r>
-      <w:r>
-        <w:rPr>
-          <w:rFonts w:ascii="Arial" w:hAnsi="Arial" w:cs="Arial"/>
-          <w:b/>
-          <w:bCs/>
-          <w:sz w:val="24"/>
-          <w:szCs w:val="24"/>
-          <w:lang w:val="sv-SE"/>
-        </w:rPr>
-        <w:t>#</w:t>
-      </w:r>
-      <w:r>
-        <w:rPr>
-          <w:rFonts w:ascii="Arial" w:hAnsi="Arial" w:cs="Arial"/>
-          <w:b/>
-          <w:sz w:val="24"/>
-          <w:szCs w:val="24"/>
-          <w:lang w:val="en-GB"/>
-        </w:rPr>
-        <w:t>Tiga Juta Lima Ratus Ribu Rupiah</w:t>
-      </w:r>
-      <w:r>
-        <w:rPr>
-          <w:rFonts w:ascii="Arial" w:hAnsi="Arial" w:cs="Arial"/>
+        <w:t>}</w:t>
+      </w:r>
+      <w:r>
+        <w:rPr>
+          <w:rFonts w:cstheme="minorHAnsi"/>
           <w:b/>
           <w:bCs/>
           <w:color w:val="000000"/>
@@ -976,7 +762,7 @@
       </w:r>
       <w:r>
         <w:rPr>
-          <w:rFonts w:ascii="Arial" w:hAnsi="Arial" w:cs="Arial"/>
+          <w:rFonts w:cstheme="minorHAnsi"/>
           <w:sz w:val="24"/>
           <w:szCs w:val="24"/>
         </w:rPr>
@@ -984,7 +770,7 @@
       </w:r>
       <w:r>
         <w:rPr>
-          <w:rFonts w:ascii="Arial" w:hAnsi="Arial" w:cs="Arial"/>
+          <w:rFonts w:cstheme="minorHAnsi"/>
           <w:sz w:val="24"/>
           <w:szCs w:val="24"/>
         </w:rPr>
@@ -992,7 +778,7 @@
       </w:r>
       <w:r>
         <w:rPr>
-          <w:rFonts w:ascii="Arial" w:hAnsi="Arial" w:cs="Arial"/>
+          <w:rFonts w:cstheme="minorHAnsi"/>
           <w:sz w:val="24"/>
           <w:szCs w:val="24"/>
         </w:rPr>
@@ -1000,7 +786,7 @@
       </w:r>
       <w:r>
         <w:rPr>
-          <w:rFonts w:ascii="Arial" w:hAnsi="Arial" w:cs="Arial"/>
+          <w:rFonts w:cstheme="minorHAnsi"/>
           <w:sz w:val="24"/>
           <w:szCs w:val="24"/>
         </w:rPr>
@@ -1008,7 +794,7 @@
       </w:r>
       <w:r>
         <w:rPr>
-          <w:rFonts w:ascii="Arial" w:hAnsi="Arial" w:cs="Arial"/>
+          <w:rFonts w:cstheme="minorHAnsi"/>
           <w:sz w:val="24"/>
           <w:szCs w:val="24"/>
         </w:rPr>
@@ -1019,7 +805,7 @@
       <w:pPr>
         <w:spacing w:after="0" w:line="360" w:lineRule="auto"/>
         <w:rPr>
-          <w:rFonts w:ascii="Arial" w:hAnsi="Arial" w:cs="Arial"/>
+          <w:rFonts w:cstheme="minorHAnsi"/>
           <w:sz w:val="24"/>
           <w:szCs w:val="24"/>
           <w:lang w:val="en-GB"/>
@@ -1031,7 +817,7 @@
         <w:spacing w:after="0" w:line="360" w:lineRule="auto"/>
         <w:jc w:val="both"/>
         <w:rPr>
-          <w:rFonts w:ascii="Arial" w:hAnsi="Arial" w:cs="Arial"/>
+          <w:rFonts w:cstheme="minorHAnsi"/>
           <w:b/>
           <w:bCs/>
           <w:sz w:val="24"/>
@@ -1041,406 +827,470 @@
       </w:pPr>
       <w:r>
         <w:rPr>
-          <w:rFonts w:ascii="Arial" w:hAnsi="Arial" w:cs="Arial"/>
+          <w:rFonts w:cstheme="minorHAnsi"/>
           <w:sz w:val="24"/>
           <w:szCs w:val="24"/>
           <w:lang w:val="sv-SE"/>
         </w:rPr>
-        <w:t xml:space="preserve">Pembayaran ditransfer melalui </w:t>
-      </w:r>
-      <w:r>
-        <w:rPr>
-          <w:rFonts w:ascii="Arial" w:hAnsi="Arial" w:cs="Arial"/>
+        <w:t xml:space="preserve">Pembayaran tersebut dapat ditransfer melalui </w:t>
+      </w:r>
+      <w:r>
+        <w:rPr>
+          <w:rFonts w:cstheme="minorHAnsi"/>
           <w:b/>
           <w:bCs/>
           <w:sz w:val="24"/>
           <w:szCs w:val="24"/>
           <w:lang w:val="sv-SE"/>
         </w:rPr>
-        <w:t xml:space="preserve">Bank BCA </w:t>
-      </w:r>
-      <w:r>
-        <w:rPr>
-          <w:rFonts w:ascii="Arial" w:hAnsi="Arial" w:cs="Arial"/>
-          <w:sz w:val="24"/>
-          <w:szCs w:val="24"/>
-        </w:rPr>
-        <w:t xml:space="preserve">dengan </w:t>
-      </w:r>
-      <w:r>
-        <w:rPr>
-          <w:rFonts w:ascii="Arial" w:hAnsi="Arial" w:cs="Arial"/>
-          <w:sz w:val="24"/>
-          <w:szCs w:val="24"/>
-          <w:lang w:val="sv-SE"/>
-        </w:rPr>
-        <w:t>No</w:t>
-      </w:r>
-      <w:r>
-        <w:rPr>
-          <w:rFonts w:ascii="Arial" w:hAnsi="Arial" w:cs="Arial"/>
-          <w:sz w:val="24"/>
-          <w:szCs w:val="24"/>
-        </w:rPr>
-        <w:t>mor</w:t>
-      </w:r>
-      <w:r>
-        <w:rPr>
-          <w:rFonts w:ascii="Arial" w:hAnsi="Arial" w:cs="Arial"/>
-          <w:sz w:val="24"/>
-          <w:szCs w:val="24"/>
-          <w:lang w:val="sv-SE"/>
-        </w:rPr>
-        <w:t xml:space="preserve"> Rek</w:t>
-      </w:r>
-      <w:r>
-        <w:rPr>
-          <w:rFonts w:ascii="Arial" w:hAnsi="Arial" w:cs="Arial"/>
-          <w:sz w:val="24"/>
-          <w:szCs w:val="24"/>
-        </w:rPr>
-        <w:t>ening</w:t>
-      </w:r>
-      <w:r>
-        <w:rPr>
-          <w:rFonts w:ascii="Arial" w:hAnsi="Arial" w:cs="Arial"/>
+        <w:t>{</w:t>
+      </w:r>
+      <w:r>
+        <w:rPr>
+          <w:rFonts w:cstheme="minorHAnsi"/>
           <w:b/>
           <w:bCs/>
           <w:sz w:val="24"/>
           <w:szCs w:val="24"/>
-        </w:rPr>
-        <w:t xml:space="preserve"> </w:t>
-      </w:r>
-      <w:r>
-        <w:rPr>
-          <w:rFonts w:ascii="Arial" w:hAnsi="Arial" w:cs="Arial"/>
+          <w:lang w:val="sv-SE"/>
+        </w:rPr>
+        <w:t>bank</w:t>
+      </w:r>
+      <w:r>
+        <w:rPr>
+          <w:rFonts w:cstheme="minorHAnsi"/>
           <w:b/>
           <w:bCs/>
           <w:sz w:val="24"/>
           <w:szCs w:val="24"/>
-          <w:lang w:val="en-GB"/>
-        </w:rPr>
-        <w:t>4730 904 571</w:t>
-      </w:r>
-      <w:r>
-        <w:rPr>
-          <w:rFonts w:ascii="Arial" w:hAnsi="Arial" w:cs="Arial"/>
+          <w:lang w:val="sv-SE"/>
+        </w:rPr>
+        <w:t>}</w:t>
+      </w:r>
+      <w:r>
+        <w:rPr>
+          <w:rFonts w:cstheme="minorHAnsi"/>
           <w:b/>
           <w:bCs/>
           <w:sz w:val="24"/>
           <w:szCs w:val="24"/>
           <w:lang w:val="sv-SE"/>
         </w:rPr>
-        <w:br/>
-      </w:r>
-      <w:r>
-        <w:rPr>
-          <w:rFonts w:ascii="Arial" w:hAnsi="Arial" w:cs="Arial"/>
+        <w:t xml:space="preserve"> </w:t>
+      </w:r>
+      <w:r>
+        <w:rPr>
+          <w:rFonts w:cstheme="minorHAnsi"/>
+          <w:sz w:val="24"/>
+          <w:szCs w:val="24"/>
+          <w:lang w:val="sv-SE"/>
+        </w:rPr>
+        <w:t>Pembayaran paling lambat</w:t>
+      </w:r>
+      <w:r>
+        <w:rPr>
+          <w:rFonts w:cstheme="minorHAnsi"/>
           <w:b/>
           <w:bCs/>
           <w:sz w:val="24"/>
           <w:szCs w:val="24"/>
           <w:lang w:val="sv-SE"/>
         </w:rPr>
-        <w:t xml:space="preserve">An. Anrio Marfizal S.Psi </w:t>
-      </w:r>
-      <w:r>
-        <w:rPr>
-          <w:rFonts w:ascii="Arial" w:hAnsi="Arial" w:cs="Arial"/>
-          <w:sz w:val="24"/>
-          <w:szCs w:val="24"/>
-          <w:lang w:val="sv-SE"/>
-        </w:rPr>
-        <w:t>Pembayaran paling lambat</w:t>
-      </w:r>
-      <w:r>
-        <w:rPr>
-          <w:rFonts w:ascii="Arial" w:hAnsi="Arial" w:cs="Arial"/>
+        <w:t xml:space="preserve"> </w:t>
+      </w:r>
+      <w:r>
+        <w:rPr>
+          <w:rFonts w:cstheme="minorHAnsi"/>
           <w:b/>
           <w:bCs/>
           <w:sz w:val="24"/>
           <w:szCs w:val="24"/>
           <w:lang w:val="sv-SE"/>
         </w:rPr>
-        <w:t xml:space="preserve"> </w:t>
-      </w:r>
-      <w:r>
-        <w:rPr>
-          <w:rFonts w:ascii="Arial" w:hAnsi="Arial" w:cs="Arial"/>
+        <w:t>{</w:t>
+      </w:r>
+      <w:r>
+        <w:rPr>
+          <w:rFonts w:cstheme="minorHAnsi"/>
           <w:b/>
           <w:bCs/>
           <w:sz w:val="24"/>
           <w:szCs w:val="24"/>
           <w:lang w:val="sv-SE"/>
         </w:rPr>
-        <w:t>23</w:t>
-      </w:r>
-      <w:r>
-        <w:rPr>
-          <w:rFonts w:ascii="Arial" w:hAnsi="Arial" w:cs="Arial"/>
+        <w:t>konfirmasi</w:t>
+      </w:r>
+      <w:r>
+        <w:rPr>
+          <w:rFonts w:cstheme="minorHAnsi"/>
           <w:b/>
           <w:bCs/>
           <w:sz w:val="24"/>
           <w:szCs w:val="24"/>
           <w:lang w:val="sv-SE"/>
         </w:rPr>
-        <w:t xml:space="preserve"> </w:t>
-      </w:r>
-      <w:r>
-        <w:rPr>
-          <w:rFonts w:ascii="Arial" w:hAnsi="Arial" w:cs="Arial"/>
+        <w:t>}</w:t>
+      </w:r>
+    </w:p>
+    <w:p>
+      <w:pPr>
+        <w:spacing w:after="0" w:line="360" w:lineRule="auto"/>
+        <w:jc w:val="both"/>
+        <w:rPr>
+          <w:rFonts w:cstheme="minorHAnsi"/>
           <w:b/>
           <w:bCs/>
           <w:sz w:val="24"/>
           <w:szCs w:val="24"/>
           <w:lang w:val="sv-SE"/>
         </w:rPr>
-        <w:t>April</w:t>
-      </w:r>
-      <w:r>
-        <w:rPr>
-          <w:rFonts w:ascii="Arial" w:hAnsi="Arial" w:cs="Arial"/>
+      </w:pPr>
+    </w:p>
+    <w:p>
+      <w:pPr>
+        <w:spacing w:after="0" w:line="360" w:lineRule="auto"/>
+        <w:jc w:val="both"/>
+        <w:rPr>
+          <w:rFonts w:cstheme="minorHAnsi"/>
           <w:b/>
           <w:bCs/>
           <w:sz w:val="24"/>
           <w:szCs w:val="24"/>
           <w:lang w:val="sv-SE"/>
         </w:rPr>
-        <w:t xml:space="preserve"> </w:t>
-      </w:r>
-      <w:r>
-        <w:rPr>
-          <w:rFonts w:ascii="Arial" w:hAnsi="Arial" w:cs="Arial"/>
+      </w:pPr>
+    </w:p>
+    <w:p>
+      <w:pPr>
+        <w:spacing w:after="0" w:line="360" w:lineRule="auto"/>
+        <w:jc w:val="both"/>
+        <w:rPr>
+          <w:rFonts w:cstheme="minorHAnsi"/>
           <w:b/>
           <w:bCs/>
           <w:sz w:val="24"/>
           <w:szCs w:val="24"/>
+        </w:rPr>
+      </w:pPr>
+    </w:p>
+    <w:p>
+      <w:pPr>
+        <w:spacing w:after="0" w:line="360" w:lineRule="auto"/>
+        <w:rPr>
+          <w:rFonts w:cstheme="minorHAnsi"/>
+          <w:sz w:val="24"/>
+          <w:szCs w:val="24"/>
+          <w:lang w:val="en-GB"/>
+        </w:rPr>
+      </w:pPr>
+      <w:r>
+        <w:rPr>
+          <w:rFonts w:ascii="Arial Narrow" w:eastAsia="Times New Roman" w:hAnsi="Arial Narrow" w:cs="Times New Roman"/>
+          <w:noProof/>
+          <w:sz w:val="24"/>
+          <w:szCs w:val="24"/>
+        </w:rPr>
+        <w:drawing>
+          <wp:anchor distT="0" distB="0" distL="114300" distR="114300" simplePos="0" relativeHeight="251660288" behindDoc="1" locked="0" layoutInCell="1" allowOverlap="1" wp14:anchorId="7A4CC539" wp14:editId="2CBE2E27">
+            <wp:simplePos x="0" y="0"/>
+            <wp:positionH relativeFrom="column">
+              <wp:posOffset>86887</wp:posOffset>
+            </wp:positionH>
+            <wp:positionV relativeFrom="paragraph">
+              <wp:posOffset>178173</wp:posOffset>
+            </wp:positionV>
+            <wp:extent cx="1552755" cy="1128957"/>
+            <wp:effectExtent l="0" t="0" r="0" b="0"/>
+            <wp:wrapNone/>
+            <wp:docPr id="3" name="Gambar 3"/>
+            <wp:cNvGraphicFramePr>
+              <a:graphicFrameLocks xmlns:a="http://schemas.openxmlformats.org/drawingml/2006/main" noChangeAspect="1"/>
+            </wp:cNvGraphicFramePr>
+            <a:graphic xmlns:a="http://schemas.openxmlformats.org/drawingml/2006/main">
+              <a:graphicData uri="http://schemas.openxmlformats.org/drawingml/2006/picture">
+                <pic:pic xmlns:pic="http://schemas.openxmlformats.org/drawingml/2006/picture">
+                  <pic:nvPicPr>
+                    <pic:cNvPr id="0" name="Picture 1"/>
+                    <pic:cNvPicPr>
+                      <a:picLocks noChangeAspect="1" noChangeArrowheads="1"/>
+                    </pic:cNvPicPr>
+                  </pic:nvPicPr>
+                  <pic:blipFill>
+                    <a:blip r:embed="rId8" cstate="print">
+                      <a:extLst>
+                        <a:ext uri="{28A0092B-C50C-407E-A947-70E740481C1C}">
+                          <a14:useLocalDpi xmlns:a14="http://schemas.microsoft.com/office/drawing/2010/main" val="0"/>
+                        </a:ext>
+                      </a:extLst>
+                    </a:blip>
+                    <a:srcRect/>
+                    <a:stretch>
+                      <a:fillRect/>
+                    </a:stretch>
+                  </pic:blipFill>
+                  <pic:spPr bwMode="auto">
+                    <a:xfrm>
+                      <a:off x="0" y="0"/>
+                      <a:ext cx="1554917" cy="1130529"/>
+                    </a:xfrm>
+                    <a:prstGeom prst="rect">
+                      <a:avLst/>
+                    </a:prstGeom>
+                    <a:noFill/>
+                    <a:ln>
+                      <a:noFill/>
+                    </a:ln>
+                  </pic:spPr>
+                </pic:pic>
+              </a:graphicData>
+            </a:graphic>
+            <wp14:sizeRelH relativeFrom="margin">
+              <wp14:pctWidth>0</wp14:pctWidth>
+            </wp14:sizeRelH>
+            <wp14:sizeRelV relativeFrom="margin">
+              <wp14:pctHeight>0</wp14:pctHeight>
+            </wp14:sizeRelV>
+          </wp:anchor>
+        </w:drawing>
+      </w:r>
+      <w:r>
+        <w:rPr>
+          <w:rFonts w:cstheme="minorHAnsi"/>
+          <w:sz w:val="24"/>
+          <w:szCs w:val="24"/>
           <w:lang w:val="sv-SE"/>
         </w:rPr>
-        <w:t>202</w:t>
-      </w:r>
-      <w:r>
-        <w:rPr>
-          <w:rFonts w:ascii="Arial" w:hAnsi="Arial" w:cs="Arial"/>
+        <w:t>Tangerang Selatan</w:t>
+      </w:r>
+      <w:r>
+        <w:rPr>
+          <w:rFonts w:cstheme="minorHAnsi"/>
+          <w:sz w:val="24"/>
+          <w:szCs w:val="24"/>
+          <w:lang w:val="sv-SE"/>
+        </w:rPr>
+        <w:t>,</w:t>
+      </w:r>
+      <w:r>
+        <w:rPr>
+          <w:rFonts w:cstheme="minorHAnsi"/>
+          <w:sz w:val="24"/>
+          <w:szCs w:val="24"/>
+          <w:lang w:val="sv-SE"/>
+        </w:rPr>
+        <w:t xml:space="preserve"> </w:t>
+      </w:r>
+      <w:r>
+        <w:rPr>
+          <w:rFonts w:cstheme="minorHAnsi"/>
+          <w:sz w:val="24"/>
+          <w:szCs w:val="24"/>
+          <w:lang w:val="en-US"/>
+        </w:rPr>
+        <w:t>{</w:t>
+      </w:r>
+      <w:r>
+        <w:rPr>
+          <w:rFonts w:cstheme="minorHAnsi"/>
+          <w:sz w:val="24"/>
+          <w:szCs w:val="24"/>
+          <w:lang w:val="en-US"/>
+        </w:rPr>
+        <w:t>tanggal</w:t>
+      </w:r>
+      <w:r>
+        <w:rPr>
+          <w:rFonts w:cstheme="minorHAnsi"/>
+          <w:sz w:val="24"/>
+          <w:szCs w:val="24"/>
+          <w:lang w:val="en-US"/>
+        </w:rPr>
+        <w:t>}</w:t>
+      </w:r>
+    </w:p>
+    <w:p>
+      <w:pPr>
+        <w:spacing w:after="0" w:line="360" w:lineRule="auto"/>
+        <w:rPr>
+          <w:rFonts w:eastAsia="Arial Unicode MS" w:cstheme="minorHAnsi"/>
           <w:b/>
           <w:bCs/>
           <w:sz w:val="24"/>
           <w:szCs w:val="24"/>
-          <w:lang w:val="sv-SE"/>
-        </w:rPr>
-        <w:t>6</w:t>
-      </w:r>
-      <w:r>
-        <w:rPr>
-          <w:rFonts w:ascii="Arial" w:hAnsi="Arial" w:cs="Arial"/>
+          <w:lang w:bidi="bn-IN"/>
+        </w:rPr>
+      </w:pPr>
+    </w:p>
+    <w:p>
+      <w:pPr>
+        <w:spacing w:after="0" w:line="360" w:lineRule="auto"/>
+        <w:rPr>
+          <w:rFonts w:eastAsia="Arial Unicode MS" w:cstheme="minorHAnsi"/>
           <w:b/>
           <w:bCs/>
           <w:sz w:val="24"/>
           <w:szCs w:val="24"/>
-          <w:lang w:val="sv-SE"/>
-        </w:rPr>
-        <w:t>.</w:t>
-      </w:r>
+          <w:lang w:bidi="bn-IN"/>
+        </w:rPr>
+      </w:pPr>
     </w:p>
     <w:p>
       <w:pPr>
-        <w:spacing w:after="0" w:line="360" w:lineRule="auto"/>
+        <w:spacing w:after="0" w:line="276" w:lineRule="auto"/>
+        <w:contextualSpacing/>
         <w:jc w:val="both"/>
         <w:rPr>
-          <w:rFonts w:ascii="Arial" w:hAnsi="Arial" w:cs="Arial"/>
-          <w:b/>
-          <w:bCs/>
-          <w:sz w:val="24"/>
-          <w:szCs w:val="24"/>
-        </w:rPr>
-      </w:pPr>
+          <w:rFonts w:eastAsia="Times New Roman" w:cstheme="minorHAnsi"/>
+          <w:sz w:val="24"/>
+          <w:szCs w:val="24"/>
+        </w:rPr>
+      </w:pPr>
+      <w:r>
+        <w:rPr>
+          <w:rFonts w:ascii="Arial Narrow" w:hAnsi="Arial Narrow"/>
+          <w:noProof/>
+        </w:rPr>
+        <w:drawing>
+          <wp:anchor distT="0" distB="0" distL="114300" distR="114300" simplePos="0" relativeHeight="251659264" behindDoc="1" locked="0" layoutInCell="1" allowOverlap="1" wp14:anchorId="69F80DF9" wp14:editId="3FDD69CC">
+            <wp:simplePos x="0" y="0"/>
+            <wp:positionH relativeFrom="column">
+              <wp:posOffset>-34116</wp:posOffset>
+            </wp:positionH>
+            <wp:positionV relativeFrom="paragraph">
+              <wp:posOffset>33852</wp:posOffset>
+            </wp:positionV>
+            <wp:extent cx="1167720" cy="267401"/>
+            <wp:effectExtent l="19050" t="57150" r="13970" b="56515"/>
+            <wp:wrapNone/>
+            <wp:docPr id="1" name="Gambar 1" descr="D:\mental coaching character\ahmad 2021 oktober\cap mckuadrat (2).png"/>
+            <wp:cNvGraphicFramePr>
+              <a:graphicFrameLocks xmlns:a="http://schemas.openxmlformats.org/drawingml/2006/main" noChangeAspect="1"/>
+            </wp:cNvGraphicFramePr>
+            <a:graphic xmlns:a="http://schemas.openxmlformats.org/drawingml/2006/main">
+              <a:graphicData uri="http://schemas.openxmlformats.org/drawingml/2006/picture">
+                <pic:pic xmlns:pic="http://schemas.openxmlformats.org/drawingml/2006/picture">
+                  <pic:nvPicPr>
+                    <pic:cNvPr id="0" name="Picture 1" descr="D:\mental coaching character\ahmad 2021 oktober\cap mckuadrat (2).png"/>
+                    <pic:cNvPicPr>
+                      <a:picLocks noChangeAspect="1" noChangeArrowheads="1"/>
+                    </pic:cNvPicPr>
+                  </pic:nvPicPr>
+                  <pic:blipFill>
+                    <a:blip r:embed="rId9" cstate="print">
+                      <a:extLst>
+                        <a:ext uri="{BEBA8EAE-BF5A-486C-A8C5-ECC9F3942E4B}">
+                          <a14:imgProps xmlns:a14="http://schemas.microsoft.com/office/drawing/2010/main">
+                            <a14:imgLayer r:embed="rId10">
+                              <a14:imgEffect>
+                                <a14:colorTemperature colorTemp="4700"/>
+                              </a14:imgEffect>
+                            </a14:imgLayer>
+                          </a14:imgProps>
+                        </a:ext>
+                        <a:ext uri="{28A0092B-C50C-407E-A947-70E740481C1C}">
+                          <a14:useLocalDpi xmlns:a14="http://schemas.microsoft.com/office/drawing/2010/main" val="0"/>
+                        </a:ext>
+                      </a:extLst>
+                    </a:blip>
+                    <a:srcRect/>
+                    <a:stretch>
+                      <a:fillRect/>
+                    </a:stretch>
+                  </pic:blipFill>
+                  <pic:spPr bwMode="auto">
+                    <a:xfrm rot="21350505">
+                      <a:off x="0" y="0"/>
+                      <a:ext cx="1198747" cy="274506"/>
+                    </a:xfrm>
+                    <a:prstGeom prst="rect">
+                      <a:avLst/>
+                    </a:prstGeom>
+                    <a:noFill/>
+                    <a:ln>
+                      <a:noFill/>
+                    </a:ln>
+                  </pic:spPr>
+                </pic:pic>
+              </a:graphicData>
+            </a:graphic>
+            <wp14:sizeRelH relativeFrom="page">
+              <wp14:pctWidth>0</wp14:pctWidth>
+            </wp14:sizeRelH>
+            <wp14:sizeRelV relativeFrom="page">
+              <wp14:pctHeight>0</wp14:pctHeight>
+            </wp14:sizeRelV>
+          </wp:anchor>
+        </w:drawing>
+      </w:r>
     </w:p>
     <w:p>
       <w:pPr>
-        <w:spacing w:after="0" w:line="360" w:lineRule="auto"/>
-        <w:rPr>
-          <w:rFonts w:ascii="Arial" w:hAnsi="Arial" w:cs="Arial"/>
+        <w:spacing w:after="0" w:line="240" w:lineRule="auto"/>
+        <w:contextualSpacing/>
+        <w:rPr>
+          <w:rFonts w:eastAsia="Times New Roman" w:cstheme="minorHAnsi"/>
+          <w:b/>
           <w:sz w:val="24"/>
           <w:szCs w:val="24"/>
           <w:lang w:val="en-GB"/>
         </w:rPr>
       </w:pPr>
-      <w:r>
-        <w:rPr>
-          <w:rFonts w:ascii="Arial" w:hAnsi="Arial" w:cs="Arial"/>
-          <w:sz w:val="24"/>
-          <w:szCs w:val="24"/>
-          <w:lang w:val="sv-SE"/>
-        </w:rPr>
-        <w:t>Tangerang Selatan</w:t>
-      </w:r>
-      <w:r>
-        <w:rPr>
-          <w:rFonts w:ascii="Arial" w:hAnsi="Arial" w:cs="Arial"/>
-          <w:sz w:val="24"/>
-          <w:szCs w:val="24"/>
-          <w:lang w:val="sv-SE"/>
-        </w:rPr>
-        <w:t>,</w:t>
-      </w:r>
-      <w:r>
-        <w:rPr>
-          <w:rFonts w:ascii="Arial" w:hAnsi="Arial" w:cs="Arial"/>
-          <w:sz w:val="24"/>
-          <w:szCs w:val="24"/>
-          <w:lang w:val="sv-SE"/>
-        </w:rPr>
-        <w:t xml:space="preserve"> </w:t>
-      </w:r>
-      <w:r>
-        <w:rPr>
-          <w:rFonts w:ascii="Arial" w:hAnsi="Arial" w:cs="Arial"/>
-          <w:sz w:val="24"/>
-          <w:szCs w:val="24"/>
-          <w:lang w:val="en-US"/>
-        </w:rPr>
-        <w:t>6</w:t>
-      </w:r>
-      <w:r>
-        <w:rPr>
-          <w:rFonts w:ascii="Arial" w:hAnsi="Arial" w:cs="Arial"/>
-          <w:sz w:val="24"/>
-          <w:szCs w:val="24"/>
-          <w:lang w:val="en-US"/>
-        </w:rPr>
-        <w:t xml:space="preserve"> </w:t>
-      </w:r>
-      <w:r>
-        <w:rPr>
-          <w:rFonts w:ascii="Arial" w:hAnsi="Arial" w:cs="Arial"/>
-          <w:sz w:val="24"/>
-          <w:szCs w:val="24"/>
-          <w:lang w:val="en-US"/>
-        </w:rPr>
-        <w:t>April</w:t>
-      </w:r>
-      <w:r>
-        <w:rPr>
-          <w:rFonts w:ascii="Arial" w:hAnsi="Arial" w:cs="Arial"/>
-          <w:sz w:val="24"/>
-          <w:szCs w:val="24"/>
-          <w:lang w:val="en-US"/>
-        </w:rPr>
-        <w:t xml:space="preserve"> 202</w:t>
-      </w:r>
-      <w:r>
-        <w:rPr>
-          <w:rFonts w:ascii="Arial" w:hAnsi="Arial" w:cs="Arial"/>
-          <w:sz w:val="24"/>
-          <w:szCs w:val="24"/>
-          <w:lang w:val="en-US"/>
-        </w:rPr>
-        <w:t>6</w:t>
-      </w:r>
     </w:p>
     <w:p>
       <w:pPr>
-        <w:spacing w:after="0" w:line="360" w:lineRule="auto"/>
-        <w:rPr>
-          <w:rFonts w:ascii="Arial" w:eastAsia="Arial Unicode MS" w:hAnsi="Arial" w:cs="Arial"/>
+        <w:spacing w:after="0" w:line="240" w:lineRule="auto"/>
+        <w:contextualSpacing/>
+        <w:rPr>
+          <w:rFonts w:eastAsia="Times New Roman" w:cstheme="minorHAnsi"/>
           <w:b/>
-          <w:bCs/>
-          <w:sz w:val="24"/>
-          <w:szCs w:val="24"/>
-          <w:lang w:bidi="bn-IN"/>
-        </w:rPr>
-      </w:pPr>
+          <w:sz w:val="24"/>
+          <w:szCs w:val="24"/>
+          <w:lang w:val="en-GB"/>
+        </w:rPr>
+      </w:pPr>
+      <w:r>
+        <w:rPr>
+          <w:rFonts w:eastAsia="Times New Roman" w:cstheme="minorHAnsi"/>
+          <w:b/>
+          <w:sz w:val="24"/>
+          <w:szCs w:val="24"/>
+          <w:lang w:val="en-GB"/>
+        </w:rPr>
+        <w:t>Anrio Marfizal, S.Psi</w:t>
+      </w:r>
     </w:p>
     <w:p>
       <w:pPr>
-        <w:spacing w:after="0" w:line="360" w:lineRule="auto"/>
-        <w:rPr>
-          <w:rFonts w:ascii="Arial" w:eastAsia="Arial Unicode MS" w:hAnsi="Arial" w:cs="Arial"/>
-          <w:b/>
-          <w:bCs/>
-          <w:sz w:val="24"/>
-          <w:szCs w:val="24"/>
-          <w:lang w:bidi="bn-IN"/>
-        </w:rPr>
-      </w:pPr>
+        <w:spacing w:after="0" w:line="240" w:lineRule="auto"/>
+        <w:contextualSpacing/>
+        <w:rPr>
+          <w:rFonts w:cstheme="minorHAnsi"/>
+          <w:sz w:val="24"/>
+          <w:szCs w:val="24"/>
+        </w:rPr>
+      </w:pPr>
+      <w:r>
+        <w:rPr>
+          <w:rFonts w:eastAsia="Times New Roman" w:cstheme="minorHAnsi"/>
+          <w:sz w:val="24"/>
+          <w:szCs w:val="24"/>
+        </w:rPr>
+        <w:t>Direktur Mental Coaching Character</w:t>
+      </w:r>
     </w:p>
     <w:p>
       <w:pPr>
         <w:spacing w:after="0" w:line="360" w:lineRule="auto"/>
         <w:rPr>
-          <w:rFonts w:ascii="Arial" w:eastAsia="Arial Unicode MS" w:hAnsi="Arial" w:cs="Arial"/>
-          <w:b/>
-          <w:bCs/>
-          <w:sz w:val="24"/>
-          <w:szCs w:val="24"/>
-          <w:lang w:bidi="bn-IN"/>
-        </w:rPr>
-      </w:pPr>
-      <w:r>
-        <w:rPr>
-          <w:sz w:val="24"/>
-          <w:szCs w:val="24"/>
-        </w:rPr>
-        <w:t xml:space="preserve">                       </w:t>
-      </w:r>
-    </w:p>
-    <w:p>
-      <w:pPr>
-        <w:spacing w:after="0" w:line="360" w:lineRule="auto"/>
-        <w:rPr>
-          <w:rFonts w:ascii="Arial" w:eastAsia="Arial Unicode MS" w:hAnsi="Arial" w:cs="Arial"/>
-          <w:b/>
-          <w:bCs/>
-          <w:sz w:val="24"/>
-          <w:szCs w:val="24"/>
-          <w:lang w:bidi="bn-IN"/>
-        </w:rPr>
-      </w:pPr>
-    </w:p>
-    <w:p>
-      <w:pPr>
-        <w:spacing w:after="0" w:line="240" w:lineRule="auto"/>
-        <w:jc w:val="both"/>
-        <w:rPr>
-          <w:rFonts w:ascii="Arial" w:hAnsi="Arial" w:cs="Arial"/>
-          <w:b/>
-          <w:sz w:val="24"/>
-          <w:szCs w:val="24"/>
-          <w:u w:val="single"/>
-        </w:rPr>
-      </w:pPr>
-      <w:r>
-        <w:rPr>
-          <w:rFonts w:ascii="Arial" w:hAnsi="Arial" w:cs="Arial"/>
-          <w:b/>
-          <w:sz w:val="24"/>
-          <w:szCs w:val="24"/>
-          <w:u w:val="single"/>
-        </w:rPr>
-        <w:t>Anrio Marfizal</w:t>
-      </w:r>
-    </w:p>
-    <w:p>
-      <w:pPr>
-        <w:spacing w:after="0" w:line="240" w:lineRule="auto"/>
-        <w:jc w:val="both"/>
-        <w:rPr>
-          <w:rFonts w:ascii="Arial" w:hAnsi="Arial" w:cs="Arial"/>
+          <w:rFonts w:cstheme="minorHAnsi"/>
           <w:sz w:val="24"/>
           <w:szCs w:val="24"/>
           <w:lang w:val="en-GB"/>
         </w:rPr>
       </w:pPr>
-      <w:r>
-        <w:rPr>
-          <w:rFonts w:ascii="Arial" w:hAnsi="Arial" w:cs="Arial"/>
-          <w:sz w:val="24"/>
-          <w:szCs w:val="24"/>
-        </w:rPr>
-        <w:t>Direktur mckuadrat</w:t>
-      </w:r>
     </w:p>
     <w:sectPr>
+      <w:headerReference w:type="default" r:id="rId11"/>
       <w:pgSz w:w="11906" w:h="16838" w:code="9"/>
       <w:pgMar w:top="1440" w:right="849" w:bottom="1276" w:left="1276" w:header="708" w:footer="708" w:gutter="0"/>
       <w:cols w:space="708"/>
@@ -1512,6 +1362,82 @@
     </w:p>
   </w:footnote>
 </w:footnotes>
+</file>
+
+<file path=word/header1.xml><?xml version="1.0" encoding="utf-8"?>
+<w:hdr xmlns:wpc="http://schemas.microsoft.com/office/word/2010/wordprocessingCanvas" xmlns:cx="http://schemas.microsoft.com/office/drawing/2014/chartex" xmlns:cx1="http://schemas.microsoft.com/office/drawing/2015/9/8/chartex" xmlns:cx2="http://schemas.microsoft.com/office/drawing/2015/10/21/chartex" xmlns:cx3="http://schemas.microsoft.com/office/drawing/2016/5/9/chartex" xmlns:cx4="http://schemas.microsoft.com/office/drawing/2016/5/10/chartex" xmlns:cx5="http://schemas.microsoft.com/office/drawing/2016/5/11/chartex" xmlns:cx6="http://schemas.microsoft.com/office/drawing/2016/5/12/chartex" xmlns:cx7="http://schemas.microsoft.com/office/drawing/2016/5/13/chartex" xmlns:cx8="http://schemas.microsoft.com/office/drawing/2016/5/14/chartex" xmlns:mc="http://schemas.openxmlformats.org/markup-compatibility/2006" xmlns:aink="http://schemas.microsoft.com/office/drawing/2016/ink" xmlns:am3d="http://schemas.microsoft.com/office/drawing/2017/model3d" xmlns:o="urn:schemas-microsoft-com:office:office" xmlns:oel="http://schemas.microsoft.com/office/2019/extlst" xmlns:r="http://schemas.openxmlformats.org/officeDocument/2006/relationships" xmlns:m="http://schemas.openxmlformats.org/officeDocument/2006/math" xmlns:v="urn:schemas-microsoft-com:vml" xmlns:wp14="http://schemas.microsoft.com/office/word/2010/wordprocessingDrawing" xmlns:wp="http://schemas.openxmlformats.org/drawingml/2006/wordprocessingDrawing" xmlns:w10="urn:schemas-microsoft-com:office:word" xmlns:w="http://schemas.openxmlformats.org/wordprocessingml/2006/main" xmlns:w14="http://schemas.microsoft.com/office/word/2010/wordml" xmlns:w15="http://schemas.microsoft.com/office/word/2012/wordml" xmlns:w16cex="http://schemas.microsoft.com/office/word/2018/wordml/cex" xmlns:w16cid="http://schemas.microsoft.com/office/word/2016/wordml/cid" xmlns:w16="http://schemas.microsoft.com/office/word/2018/wordml" xmlns:w16du="http://schemas.microsoft.com/office/word/2023/wordml/word16du" xmlns:w16sdtdh="http://schemas.microsoft.com/office/word/2020/wordml/sdtdatahash" xmlns:w16sdtfl="http://schemas.microsoft.com/office/word/2024/wordml/sdtformatlock" xmlns:w16se="http://schemas.microsoft.com/office/word/2015/wordml/symex" xmlns:wpg="http://schemas.microsoft.com/office/word/2010/wordprocessingGroup" xmlns:wpi="http://schemas.microsoft.com/office/word/2010/wordprocessingInk" xmlns:wne="http://schemas.microsoft.com/office/word/2006/wordml" xmlns:wps="http://schemas.microsoft.com/office/word/2010/wordprocessingShape" mc:Ignorable="w14 w15 w16se w16cid w16 w16cex w16sdtdh w16sdtfl w16du wp14">
+  <w:p>
+    <w:pPr>
+      <w:pStyle w:val="Header"/>
+    </w:pPr>
+    <w:r>
+      <w:rPr>
+        <w:noProof/>
+      </w:rPr>
+      <w:drawing>
+        <wp:anchor distT="0" distB="0" distL="114300" distR="114300" simplePos="0" relativeHeight="251658240" behindDoc="1" locked="0" layoutInCell="1" allowOverlap="1" wp14:anchorId="653C278A" wp14:editId="289615BA">
+          <wp:simplePos x="0" y="0"/>
+          <wp:positionH relativeFrom="page">
+            <wp:posOffset>17474</wp:posOffset>
+          </wp:positionH>
+          <wp:positionV relativeFrom="paragraph">
+            <wp:posOffset>-449580</wp:posOffset>
+          </wp:positionV>
+          <wp:extent cx="7566101" cy="10698059"/>
+          <wp:effectExtent l="0" t="0" r="0" b="8255"/>
+          <wp:wrapNone/>
+          <wp:docPr id="1950428330" name="Picture 1"/>
+          <wp:cNvGraphicFramePr>
+            <a:graphicFrameLocks xmlns:a="http://schemas.openxmlformats.org/drawingml/2006/main" noChangeAspect="1"/>
+          </wp:cNvGraphicFramePr>
+          <a:graphic xmlns:a="http://schemas.openxmlformats.org/drawingml/2006/main">
+            <a:graphicData uri="http://schemas.openxmlformats.org/drawingml/2006/picture">
+              <pic:pic xmlns:pic="http://schemas.openxmlformats.org/drawingml/2006/picture">
+                <pic:nvPicPr>
+                  <pic:cNvPr id="1950428330" name="Picture 1"/>
+                  <pic:cNvPicPr>
+                    <a:picLocks noChangeAspect="1" noChangeArrowheads="1"/>
+                  </pic:cNvPicPr>
+                </pic:nvPicPr>
+                <pic:blipFill>
+                  <a:blip r:embed="rId1">
+                    <a:extLst>
+                      <a:ext uri="{28A0092B-C50C-407E-A947-70E740481C1C}">
+                        <a14:useLocalDpi xmlns:a14="http://schemas.microsoft.com/office/drawing/2010/main" val="0"/>
+                      </a:ext>
+                    </a:extLst>
+                  </a:blip>
+                  <a:stretch>
+                    <a:fillRect/>
+                  </a:stretch>
+                </pic:blipFill>
+                <pic:spPr bwMode="auto">
+                  <a:xfrm>
+                    <a:off x="0" y="0"/>
+                    <a:ext cx="7566101" cy="10698059"/>
+                  </a:xfrm>
+                  <a:prstGeom prst="rect">
+                    <a:avLst/>
+                  </a:prstGeom>
+                  <a:noFill/>
+                  <a:ln>
+                    <a:noFill/>
+                  </a:ln>
+                </pic:spPr>
+              </pic:pic>
+            </a:graphicData>
+          </a:graphic>
+          <wp14:sizeRelH relativeFrom="margin">
+            <wp14:pctWidth>0</wp14:pctWidth>
+          </wp14:sizeRelH>
+          <wp14:sizeRelV relativeFrom="margin">
+            <wp14:pctHeight>0</wp14:pctHeight>
+          </wp14:sizeRelV>
+        </wp:anchor>
+      </w:drawing>
+    </w:r>
+  </w:p>
+</w:hdr>
 </file>
 
 <file path=word/numbering.xml><?xml version="1.0" encoding="utf-8"?>

</xml_diff>